<commit_message>
Regenerate the seventeen Informed edit docs from the finished pages, record the fix-up pass, update START HERE
The reviewed originals from both reviewers remain in Module Edit Docs/Gustavo files/
(untracked). The regenerated docs carry each page as it stands after the 2026-09-13 pass.
Issue files for I2, I6, I7, I10, I14, I15 and I16 note the insertions applied in the
fix-up pass. START HERE records the finished pass, the Core rename and the next step.

Co-Authored-By: Claude Fable 5.1 <noreply@anthropic.com>
</commit_message>
<xml_diff>
--- a/Module Edit Docs/I10 - Edit Doc.docx
+++ b/Module Edit Docs/I10 - Edit Doc.docx
@@ -28,7 +28,7 @@
           <w:color w:val="B00000"/>
           <w:sz w:val="21"/>
         </w:rPr>
-        <w:t>ISSUES FLAGGED FOR THIS MODULE (4)</w:t>
+        <w:t>ISSUES FLAGGED FOR THIS MODULE (6)</w:t>
       </w:r>
     </w:p>
     <w:p>
@@ -48,7 +48,27 @@
           <w:color w:val="0050A0"/>
           <w:sz w:val="19"/>
         </w:rPr>
-        <w:t>[DECISION: Two things were added beyond the brief and should be confirmed as Informed rather than Expert. Kenny's geometric model, which introduces a pericardial-pressure term and a "cardiac resistance" term no other module uses, and Uemura's two-atrium venous return surface, included as the honest limit of the one-loop treatment.]</w:t>
+        <w:t>[DECISION: Two things go beyond the Informed brief and should be confirmed as Informed rather than Expert. Kenny's geometric model, which introduces a pericardial-pressure term and a "cardiac resistance" term no other module uses, and Uemura's two-atrium venous return surface, included as the acknowledged limit of the one-loop treatment. Not resolved by Gustavo's I10 pass, so it stays.]</w:t>
+      </w:r>
+    </w:p>
+    <w:p>
+      <w:r>
+        <w:rPr>
+          <w:i/>
+          <w:color w:val="5A5A5A"/>
+          <w:sz w:val="19"/>
+        </w:rPr>
+        <w:t>[NOTE: Gustavo's deletion of the Guarracino 55-patient paragraph and the norepinephrine "human numbers" paragraph turned out to be a replacement, not a cut: his inserted text (missed by the first extraction) restates the verified data and adds dynamic arterial elastance. Applied on 2026-09-13, old paragraphs removed. Two of his numbers were not in the abstract and were left out (see the last NOTE).]</w:t>
+      </w:r>
+    </w:p>
+    <w:p>
+      <w:r>
+        <w:rPr>
+          <w:i/>
+          <w:color w:val="0050A0"/>
+          <w:sz w:val="19"/>
+        </w:rPr>
+        <w:t>[DECISION: Gustavo's tracked change to the worked-example table ("Pump depressed alone" row) changes Pmsf from 8 to 16 and P_RA from 3.2 to 8.0 while leaving Ppc, R_VR, R_cardiac and Q unchanged. Applying it breaks the module's own equation: with Pmsf=16, Ppc=-3, R_VR=1.4, R_cardiac=1.8, Q should be 5.9, not 3.4, and P_RA should be about 7.7, not 8.0 exactly. Not applied. Needs the reviewer's intended inputs.]</w:t>
       </w:r>
     </w:p>
     <w:p>
@@ -58,17 +78,7 @@
           <w:color w:val="B00000"/>
           <w:sz w:val="19"/>
         </w:rPr>
-        <w:t>[SOURCE: Deck slide 341 and Funk say positive pressure depresses the cardiac function curve through RV afterload. Marini 1981 found function curves plotted against transmural pressure indistinguishable on and off 15 cmH2O PEEP. The page follows Marini and reconciles the two explicitly.]</w:t>
-      </w:r>
-    </w:p>
-    <w:p>
-      <w:r>
-        <w:rPr>
-          <w:i/>
-          <w:color w:val="B00000"/>
-          <w:sz w:val="19"/>
-        </w:rPr>
-        <w:t>[SOURCE: The Funk intubation passage quoted in hemodynamics-proposal-2026.md reads "VR increases (a shallower slope of the VR curve)", which is self-contradictory. Written correctly as a fall.]</w:t>
+        <w:t>[SOURCE: Marini 1981 found canine ventricular function curves plotted against transmural pressure indistinguishable on and off 15 cmH2O PEEP; the page follows Marini and now also notes the exception for substantial hyperinflation or overdistension, linked forward to I9 and I12.]</w:t>
       </w:r>
     </w:p>
     <w:p>
@@ -78,7 +88,17 @@
           <w:color w:val="5A5A5A"/>
           <w:sz w:val="19"/>
         </w:rPr>
-        <w:t>[NOTE: v2022 slide319, the Guyton slope figure, is an EMF that hung the renderer and is unused.]</w:t>
+        <w:t>[NOTE: v2022 slide319, the Guyton slope figure, is an EMF that hung the renderer and remains unused.]</w:t>
+      </w:r>
+    </w:p>
+    <w:p>
+      <w:r>
+        <w:rPr>
+          <w:i/>
+          <w:color w:val="5A5A5A"/>
+          <w:sz w:val="19"/>
+        </w:rPr>
+        <w:t>[NOTE: 2026-09-13 fixup pass applied Gustavo's six held-back insertion blocks (Guarracino/Pinsky 55-patient volume-expansion and dynamic-arterial-elastance results, and the geometry paragraph on a bolus moving several parts of the loop). These were his replacement text for the two paragraphs flagged above as "not applied," so the old Guarracino composite-result paragraph and the old norepinephrine human-numbers paragraph were removed and replaced with his fuller versions (both restate the same verified data plus the new dynamic-arterial-elastance material), resolving that earlier decision. Guarracino 2013 PMID 23786764 named in the fixup brief is wrong (a diaphragm-weakness paper); the correct source for the 55-patient numbers is Guarracino, Bertini and Pinsky, Crit Care 2019;23:118, PMID 30987647, already in this page's reference list. Verified against its abstract: 35/55 reached MAP &gt;65 mmHg after volume expansion, and 12/20 reached MAP &gt;65 mmHg after norepinephrine. Not verifiable and left out: the "49 of 55 patients increased cardiac index by more than 15 percent" claim, and the dynamic-arterial-elastance values 1.00 (S.D. +/- 0.13) versus 0.67 (S.D. +/- 0.14); the abstract gives no such CI-threshold count and no numeric Eadyn values, only that responders had higher Eadyn. lint_page.py i10.html: 0 problems.]</w:t>
       </w:r>
     </w:p>
     <w:p/>
@@ -179,8 +199,16 @@
       </w:r>
     </w:p>
     <w:p>
+      <w:pPr>
+        <w:pStyle w:val="Heading3"/>
+      </w:pPr>
       <w:r>
-        <w:t>Kenny has set out the simplest honest version of the algebra, in which each curve is approximated over its working range by a straight line and the two lines form two right triangles sharing an apex. The apex is the operating point. Its height is the flow, and its position along the horizontal axis is the right atrial pressure.</w:t>
+        <w:t>Solving the intersection instead of sketching it</w:t>
+      </w:r>
+    </w:p>
+    <w:p>
+      <w:r>
+        <w:t>Kenny has set out the simplest transparent version of the algebra, in which each curve is approximated over its working range by a straight line and the two lines form two right triangles sharing an apex. The apex is the operating point. Its height is the flow, and its position along the horizontal axis is the right atrial pressure.</w:t>
       </w:r>
     </w:p>
     <w:p>
@@ -268,6 +296,14 @@
     <w:p>
       <w:r>
         <w:t>Writing the heart as a resistance takes some getting used to and it is worth being clear that Rcardiac is not a Poiseuille resistance. Nothing is being obstructed. It is the reciprocal of the slope of the cardiac function curve, so a strong heart, which produces a large increment of flow for a small increment of filling pressure, has a low Rcardiac, and a failing heart has a high one. The value of putting it in these units is that it makes the pump and the circuit commensurable, and the equation then says something no verbal account of the two curves can say: the heart and the vasculature limit flow additively. Neither one sets the output. They share a single driving pressure between them in proportion to their resistances.</w:t>
+      </w:r>
+    </w:p>
+    <w:p>
+      <w:pPr>
+        <w:pStyle w:val="Heading3"/>
+      </w:pPr>
+      <w:r>
+        <w:t>Four independent variables and two dependent ones</w:t>
       </w:r>
     </w:p>
     <w:p>
@@ -626,12 +662,12 @@
     </w:tbl>
     <w:p>
       <w:r>
-        <w:t>The arrow columns show the effect of raising each variable, with the other three held still. Two features of that table do the work for the rest of the module. The first is that no independent variable moves flow without also moving right atrial pressure, which is why a right atrial pressure is never uninformative even though it is frequently uninterpretable. The second is that the two columns disagree in sign for two of the four variables and agree for the other two. That single fact is the whole diagnostic content of watching the two numbers together, and it is developed below.</w:t>
+        <w:t>The arrow columns show the effect of raising each variable, with the other three held still. Two features of that table do the work for the rest of the module. The first is that no independent variable moves flow without also moving right atrial pressure, which is why a right atrial pressure is never uninformative even though it is frequently uninterpretable on its own. The second is that the two columns disagree in sign for two of the four variables and agree for the other two. That single fact is the whole diagnostic content of watching the two numbers together, and it is developed below.</w:t>
       </w:r>
     </w:p>
     <w:p>
       <w:r>
-        <w:t>The fourth row is the one most often left out of the classical two-curve teaching, and leaving it out is what makes heart-lung interaction look like a separate subject. It is not separate. The pressure surrounding the heart is a term in the equation that determines cardiac output, and every breath changes it. Marini, Culver and Butler demonstrated the point cleanly in fourteen anaesthetised dogs, constructing ventricular function curves with venous return controlled through an external circuit and stepped from 1 to 4.5 L/min, with and without 15 cmH2O of PEEP. Curves plotted against transmural pressure on and off PEEP were statistically indistinguishable. Their conclusion is precisely the one the equation predicts: the haemodynamic changes produced by PEEP are the combined effects of reduced preload and raised juxtacardiac pressure, with no ventricular dysfunction required to explain them.</w:t>
+        <w:t>The fourth row is the one most often left out of the classical two-curve teaching, and leaving it out is what makes heart-lung interaction look like a separate subject. It is not separate. The pressure surrounding the heart is a term in the equation that can determine cardiac output, and every breath changes it. Marini, Culver and Butler demonstrated the point cleanly in fourteen anaesthetised dogs, constructing ventricular function curves with venous return controlled through an external circuit and stepped from 1 to 4.5 L/min, with and without 15 cmH2O of PEEP. Curves plotted against transmural pressure on and off PEEP were statistically indistinguishable. Their conclusion is precisely the one the equation predicts: the haemodynamic changes produced by PEEP are the combined effects of reduced preload and raised juxtacardiac pressure, with no ventricular dysfunction required to explain them. That interpretation, however, assumes that PEEP has not produced substantial hyperinflation or overdistension. When pulmonary vascular resistance rises disproportionately, the resulting increase in RV afterload can itself impair right ventricular function and contribute to the fall in cardiac output. This mechanism was introduced briefly in Module I9 (opens in a new tab) and is explored in greater depth in the heart-lung interaction module, Module I12 (opens in a new tab).</w:t>
       </w:r>
     </w:p>
     <w:p>
@@ -769,6 +805,14 @@
       </w:r>
     </w:p>
     <w:p>
+      <w:pPr>
+        <w:pStyle w:val="Heading3"/>
+      </w:pPr>
+      <w:r>
+        <w:t>A fluid bolus</w:t>
+      </w:r>
+    </w:p>
+    <w:p>
       <w:r>
         <w:t>The first movement is the expected one. The stressed fraction of the infused volume raises Pmsf, and the venous return line shifts to the right in parallel, intersecting the cardiac function curve at a higher flow. Module I7 is where the arithmetic of how much of an infused litre survives to become stressed volume lives, and Module I8 gives the measured size of the Pmsf rise in ventilated patients. That first movement, however, does not account for the whole of the flow increase.</w:t>
       </w:r>
@@ -780,12 +824,20 @@
     </w:p>
     <w:p>
       <w:r>
-        <w:t>A fourth movement was not in the 1955 framework at all and has been measured only recently. Monge García and colleagues studied 81 septic shock patients before and after a fluid challenge and found that volume expansion significantly reduced arterial load, with effective arterial elastance falling from 1.68 to 1.57 mmHg/mL and systemic vascular resistance from 1035 to 928 dyn·s·cm−5. In the subgroup of preload responders whose arterial pressure did not change, elastance fell from 1.74 to 1.55 mmHg/mL, with both the resistive and the pulsatile components contributing. Their conclusion answers a question that puzzles trainees constantly, which is why a patient can raise cardiac output after fluid without raising blood pressure: 54 of the 81 patients were preload responders and only 24 of those were also pressure responders. A falling arterial load is itself a fall in left ventricular afterload, so this fourth movement lifts the cardiac function curve again by a route entirely separate from viscosity.</w:t>
+        <w:t>A fourth movement was not in the 1955 framework at all and has been measured only recently. Monge García and colleagues studied 81 septic shock patients before and after a fluid challenge and found that volume expansion significantly reduced arterial load, with effective arterial elastance falling from 1.68 to 1.57 mmHg/mL and systemic vascular resistance from 1035 to 928 dyn·s·cm−5. In the subgroup of preload responders whose arterial pressure did not change, elastance fell from 1.74 to 1.55 mmHg/mL, with both the resistive and the pulsatile components contributing. Part of that fall is definitional rather than purely mechanical, however: because arterial elastance is calculated as end-systolic pressure divided by stroke volume, a rise in stroke volume alone lowers the calculated value even when end-systolic pressure and true arterial load are unchanged, so the finding is better read as a plausible reduction in load than as a clean isolation of vasodilatation from the arithmetic of the ratio. Their conclusion answers a question that puzzles trainees constantly, which is why a patient can raise cardiac output after fluid without raising blood pressure: 54 of the 81 patients were preload responders and only 24 of those were also pressure responders. A falling arterial load is itself a fall in left ventricular afterload, so this fourth movement lifts the cardiac function curve again by a route entirely separate from viscosity.</w:t>
       </w:r>
     </w:p>
     <w:p>
       <w:r>
-        <w:t>Guarracino, Bertini and Pinsky measured the composite result in 55 patients resuscitated according to the Surviving Sepsis Guidelines. Volume expansion raised mean arterial pressure, cardiac index, right atrial pressure, the mean systemic pressure analogue and the venous return pressure gradient, and it also raised contractility as end-systolic elastance while lowering heart rate and arterial elastance, so that ventricular-arterial coupling normalised. A bolus, in other words, moves the venous return intercept, the venous return slope and the cardiac function slope in the same direction at once.</w:t>
+        <w:t>Guarracino, Bertini and Pinsky measured the composite result in 55 patients resuscitated according to the Surviving Sepsis Guidelines. Volume expansion raised mean arterial pressure, cardiac index, right atrial pressure, the mean systemic pressure analogue and the venous return pressure gradient, while also increasing contractility as end-systolic elastance, an effect the authors attributed at least in part to improved coronary perfusion as arterial pressure was restored. At the same time, heart rate and arterial elastance fell, so ventricular-arterial coupling moved toward normal. But the pressure and flow responses were not the same: only 35 of the 55 patients reached a mean arterial pressure above 65 mmHg. This distinction introduces another useful arterial concept, dynamic arterial elastance, calculated as the ratio of pulse pressure variation to stroke volume variation (PPV/SVV). Before volume expansion, dynamic arterial elastance was substantially higher in patients whose arterial pressure subsequently responded than in those whose pressure did not. Preload responsiveness therefore asks whether increasing preload will increase flow, whereas dynamic arterial elastance asks a different question: how effectively will that change in flow be translated into arterial pressure? We will return to its physiology, interpretation and limitations in Module I13 (opens in a new tab). A bolus, in other words, can move several parts of the closed loop at once: the venous return intercept, the venous return slope and the cardiac function slope, while simultaneously changing arterial load and ventricular-arterial coupling.</w:t>
+      </w:r>
+    </w:p>
+    <w:p>
+      <w:pPr>
+        <w:pStyle w:val="Heading3"/>
+      </w:pPr>
+      <w:r>
+        <w:t>Norepinephrine</w:t>
       </w:r>
     </w:p>
     <w:p>
@@ -795,7 +847,15 @@
     </w:p>
     <w:p>
       <w:r>
-        <w:t>The human numbers for the first two movements, and for what happens when the drug is withdrawn, are in Module I8. What belongs here is the geometry. Two of the three movements act on the venous return line in opposite directions, so the net effect on flow is the difference between two comparable quantities, and small differences between patients in venous compliance and in remaining unstressed reserve decide the sign. That is the structural reason the same dose increment helps one patient and does nothing for the next. In Guarracino's cohort, norepinephrine raised arterial elastance, right atrial pressure, the mean systemic pressure analogue and the coupling ratio while lowering heart rate, pulse pressure variation and left ventricular ejection efficiency, and of the twenty patients who received it only twelve reached a mean arterial pressure above 65 mmHg.</w:t>
+        <w:t>The human numbers for the first two movements, and for what happens when the drug is withdrawn, are in Module I8 (opens in a new tab). What belongs here is the geometry. Two of the three movements act on the venous return line in opposite directions, so the net effect on flow is the difference between two comparable quantities, and small differences between patients in venous capacitance and in remaining unstressed reserve help decide the sign. That is one structural reason the same dose increment helps one patient and does little for the next. But these venous effects coexist with what norepinephrine is doing to the ventricle and arterial system. In Guarracino's cohort, norepinephrine raised arterial elastance, right atrial pressure and the mean systemic pressure analogue while lowering heart rate, pulse pressure variation and left ventricular ejection efficiency when the group was considered as a whole. Only 12 of the 20 patients treated with norepinephrine reached a mean arterial pressure above 65 mmHg. Yet the subgroup analysis showed that this average concealed markedly different ventricular responses. Patients who responded to norepinephrine with an increase in cardiac output increased end-systolic elastance and improved ventricular-arterial coupling, whereas nonresponders did not. Similarly, patients who achieved the arterial-pressure target entered the norepinephrine step with greater contractile reserve. Thus norepinephrine can simultaneously recruit stressed volume and raise the mean systemic pressure analogue, increase resistance to venous return and ventricular afterload, and, in some patients, recruit enough contractility to accommodate that greater load. Whether pressure and flow ultimately rise therefore depends on the balance of all of these movements, not on any one of them in isolation.</w:t>
+      </w:r>
+    </w:p>
+    <w:p>
+      <w:pPr>
+        <w:pStyle w:val="Heading3"/>
+      </w:pPr>
+      <w:r>
+        <w:t>An inotrope, and the trap in the trajectory</w:t>
       </w:r>
     </w:p>
     <w:p>
@@ -806,6 +866,14 @@
     <w:p>
       <w:r>
         <w:t>The trap is what the falling right atrial pressure invites. A clinician watching the number fall while the patient improves will read it as evidence that the patient has become underfilled, and give volume. In a patient whose operating point has moved onto the steep part of the venous return line, that will work. In one whose cardiac function curve has flattened, it will not, and the fall in right atrial pressure was reporting the change in the slope of the cardiac line rather than anything about volume.</w:t>
+      </w:r>
+    </w:p>
+    <w:p>
+      <w:pPr>
+        <w:pStyle w:val="Heading3"/>
+      </w:pPr>
+      <w:r>
+        <w:t>A positive pressure breath, and the moment of intubation</w:t>
       </w:r>
     </w:p>
     <w:p>
@@ -1580,12 +1648,20 @@
     </w:p>
     <w:p>
       <w:r>
-        <w:t>Exercise is the extreme demonstration and there are human measurements. Notarius and Magder compared central venous pressure from rest to the onset of upright exercise in four healthy subjects and six patients after heart transplantation, who have a delayed cardiac response. Central venous pressure rose immediately by 4.0 plus or minus 0.4 mmHg in the normal subjects and 4.6 plus or minus 0.6 mmHg in the transplant recipients, which is the muscle pump shifting blood centrally in both groups. After three minutes the difference appeared. In the normal subjects central venous pressure stayed put, at 2.0 plus or minus 1.1 mmHg against 2.6 plus or minus 1.8 at onset, while in the transplant recipients it rose further, to 7.0 plus or minus 0.8 mmHg against 3.5 plus or minus 1.1 at onset. The circuit did the same thing in both groups. What differed was whether the cardiac function curve moved with it. A normal heart holds the operating point at almost the same pressure while flow multiplies, and a heart that cannot steepen its curve is forced to buy the extra flow with pressure.</w:t>
+        <w:t>Exercise is the extreme demonstration and there are human measurements. Notarius and Magder compared central venous pressure from rest to the onset of upright exercise in four healthy subjects and six patients after heart transplantation, who have a delayed cardiac response. Central venous pressure rose immediately by 4.0 (S.D. +/- 0.4 mmHg) in the normal subjects and 4.6 (S.D. +/- 0.6 mmHg) in the transplant recipients, which is the muscle pump shifting blood centrally in both groups. After three minutes the difference appeared. In the normal subjects central venous pressure stayed put, at 2.0 (S.D. +/- 1.1 mmHg) against 2.6 (S.D. +/- 1.8) at onset, while in the transplant recipients it rose further, to 7.0 (S.D. +/- 0.8 mmHg) against 3.5 (S.D. +/- 1.1) at onset. The circuit did the same thing in both groups. What differed was whether the cardiac function curve moved with it. A normal heart holds the operating point at almost the same pressure while flow multiplies, and a heart that cannot steepen its curve is forced to buy the extra flow with pressure.</w:t>
       </w:r>
     </w:p>
     <w:p>
       <w:r>
         <w:t>Magder, Famulari and Gariepy show how much has to change for the circuit to deliver those flows at all. Modelling a 70 kg adult with two parallel venous compartments of different time constants, adjustments to cardiac and circuit parameters alone took cardiac output only from 5 to 15.6 L/min, because volume accumulated in the slow muscle compartment. Adding the muscle pump, which decompresses that compartment, allowed 23.4 L/min. A fivefold cardiac output is a redistribution achievement, and the heart's contribution is to keep Rcardiac low enough that the extra flow is not paid for in filling pressure.</w:t>
+      </w:r>
+    </w:p>
+    <w:p>
+      <w:pPr>
+        <w:pStyle w:val="Heading3"/>
+      </w:pPr>
+      <w:r>
+        <w:t>What it means when right atrial pressure does move</w:t>
       </w:r>
     </w:p>
     <w:p>
@@ -2059,7 +2135,7 @@
     </w:p>
     <w:p>
       <w:r>
-        <w:t>Cardiac limitation is the first case, and it is the same thing as preload unresponsiveness stated in the vocabulary of the model. When the apex sits above the pressure at which the cardiac function curve plateaus, flow is set by the plateau height and by the pressure surrounding the heart, and by nothing on the venous side at all. Raising Pmsf or lowering RVR then moves right atrial pressure and does not move flow. This is a considerably more precise statement than the usual one about the flat part of the Starling curve, because it identifies exactly which two variables have been rendered inert and predicts what the failed intervention will do instead: it will raise the filling pressure, and it will therefore raise the outflow pressure that every organ has to drain into, which is the tissue afterload that Module I7 identifies as the defining hazard of Interface III.</w:t>
+        <w:t>Cardiac limitation is the first case, and it is the same thing as preload unresponsiveness stated in the vocabulary of the model. When the apex sits above the pressure at which the cardiac function curve plateaus, flow is set by the plateau height and by the pressure surrounding the heart, and by nothing on the venous side at all. Raising Pmsf or lowering RVR then moves right atrial pressure and does not move flow. This is a considerably more precise statement than the usual one about the flat part of the cardiac function curve, because it identifies exactly which two variables have been rendered inert and predicts what the failed intervention will do instead: it will raise the filling pressure, and it will therefore raise the outflow pressure that every organ has to drain into, which is the tissue afterload that Module I7 identifies as the defining hazard of Interface III.</w:t>
       </w:r>
     </w:p>
     <w:p>
@@ -2074,7 +2150,7 @@
           <w:color w:val="9A6B00"/>
           <w:sz w:val="19"/>
         </w:rPr>
-        <w:t>[Physiologic Insight box: The three regions explain why a single trial of therapy is so often uninformative. The same 500 mL produces a large rise in flow with a small rise in pressure in the middle region, a small rise in flow with a large rise in pressure near cardiac limitation, and no rise in flow at all beyond it. The three results are not three different patients and they are not measurement error. They are one relationship sampled at three points along it, which is exactly why the dynamic tests in Module I11 exist: each of them is a reversible probe designed to find out which region the patient is currently in before an irreversible intervention is committed to. The same logic runs the other way for a diagnosis. A patient in whom nothing done to the heart changes the flow is telling you that the limit is venous, and a patient in whom nothing done to the volume changes the flow is telling you that the limit is cardiac. Both statements are available from interventions you were going to make anyway, provided you measure flow rather than pressure. (target: i11.html)]</w:t>
+        <w:t>[Physiologic Insight box: The three regions explain why a single trial of therapy is so often uninformative. The same 500 mL produces a large rise in flow with a small rise in pressure in the middle region, a small rise in flow with a large rise in pressure near cardiac limitation, and no rise in flow at all beyond it. The three results are not three different patients and they are not measurement error. They are one relationship sampled at three points along it. This also gives the change in right atrial pressure during a fluid bolus a useful role that its baseline value does not have. A static RAP cannot tell whether the patient will respond to volume, but once a defined preload challenge is given, a progressively larger rise in RAP for a progressively smaller gain in flow signals that the operating point is approaching cardiac limitation. Flow therefore tells you whether the bolus worked, and the rise in right atrial pressure tells you increasingly what it cost. This is exactly why the dynamic tests in Module I11 exist: each is a reversible probe designed to find out which region the patient is currently in before an irreversible intervention is committed to. The same logic runs the other way for a diagnosis. A patient in whom nothing done to the heart changes the flow is telling you that the limit is venous, and a patient in whom nothing done to the volume changes the flow is telling you that the limit is cardiac. Both statements are available from interventions you were going to make anyway, provided responsiveness itself is judged from flow rather than pressure. (target: i11.html)]</w:t>
       </w:r>
     </w:p>
     <w:p>
@@ -2091,6 +2167,14 @@
       </w:r>
     </w:p>
     <w:p>
+      <w:pPr>
+        <w:pStyle w:val="Heading3"/>
+      </w:pPr>
+      <w:r>
+        <w:t>Starting at Interface IV: an acute rise in pulmonary vascular load</w:t>
+      </w:r>
+    </w:p>
+    <w:p>
       <w:r>
         <w:t>A pulmonary embolism, an episode of hypoxaemic vasoconstriction, or a period of overdistension raises the load on the right ventricle. In the vocabulary of this module the right ventricle is part of the cardiac function curve, so Rcardiac rises and the curve flattens. The apex slides down and to the right: flow falls and right atrial pressure rises, which is the first row of the diagnostic table.</w:t>
       </w:r>
@@ -2103,6 +2187,14 @@
     <w:p>
       <w:r>
         <w:t>The therapeutic reading follows from where the loop can be broken. Restoring systemic pressure interrupts the supply arm without touching the load. Reducing the pulmonary load lowers Rcardiac directly. Giving volume raises Pmsf, which in the middle region would help, but in a ventricle already at cardiac limitation raises PRA and Ppc instead and makes two other links worse.</w:t>
+      </w:r>
+    </w:p>
+    <w:p>
+      <w:pPr>
+        <w:pStyle w:val="Heading3"/>
+      </w:pPr>
+      <w:r>
+        <w:t>Starting at Interface II: distributive shock and its treatment</w:t>
       </w:r>
     </w:p>
     <w:p>

</xml_diff>